<commit_message>
feat: complete createProduct logic in productService
</commit_message>
<xml_diff>
--- a/Final/操作流程1.docx
+++ b/Final/操作流程1.docx
@@ -10,8 +10,6 @@
           <w:bCs/>
         </w:rPr>
       </w:pPr>
-      <w:bookmarkStart w:id="0" w:name="_GoBack"/>
-      <w:bookmarkEnd w:id="0"/>
       <w:r>
         <w:rPr>
           <w:rFonts w:ascii="Segoe UI Symbol" w:hAnsi="Segoe UI Symbol" w:cs="Segoe UI Symbol"/>
@@ -8628,17 +8626,19 @@
       </w:r>
       <w:r>
         <w:rPr>
-          <w:b/>
-          <w:bCs/>
-        </w:rPr>
-        <w:t xml:space="preserve"> </w:t>
-      </w:r>
-      <w:r>
-        <w:rPr>
-          <w:b/>
-          <w:bCs/>
-        </w:rPr>
-        <w:t>buyer.html</w:t>
+          <w:rFonts w:hint="eastAsia"/>
+          <w:b/>
+          <w:bCs/>
+          <w:lang w:eastAsia="zh-HK"/>
+        </w:rPr>
+        <w:t>買家</w:t>
+      </w:r>
+      <w:r>
+        <w:rPr>
+          <w:b/>
+          <w:bCs/>
+        </w:rPr>
+        <w:t>.html</w:t>
       </w:r>
     </w:p>
     <w:p>
@@ -8845,8 +8845,19 @@
           <w:b/>
           <w:bCs/>
         </w:rPr>
-        <w:t>到貨勾選</w:t>
-      </w:r>
+        <w:t>到貨</w:t>
+      </w:r>
+      <w:r>
+        <w:rPr>
+          <w:rFonts w:hint="eastAsia"/>
+          <w:b/>
+          <w:bCs/>
+          <w:lang w:eastAsia="zh-HK"/>
+        </w:rPr>
+        <w:t>標記</w:t>
+      </w:r>
+      <w:bookmarkStart w:id="0" w:name="_GoBack"/>
+      <w:bookmarkEnd w:id="0"/>
     </w:p>
     <w:p>
       <w:pPr>
@@ -16025,7 +16036,7 @@
 </file>
 
 <file path=customXml/itemProps1.xml><?xml version="1.0" encoding="utf-8"?>
-<ds:datastoreItem xmlns:ds="http://schemas.openxmlformats.org/officeDocument/2006/customXml" ds:itemID="{C6CE7878-43C6-4B77-850F-3B7867FF489D}">
+<ds:datastoreItem xmlns:ds="http://schemas.openxmlformats.org/officeDocument/2006/customXml" ds:itemID="{B9285BE1-8196-4FB1-A981-F4AE126B4B1F}">
   <ds:schemaRefs>
     <ds:schemaRef ds:uri="http://schemas.openxmlformats.org/officeDocument/2006/bibliography"/>
   </ds:schemaRefs>

</xml_diff>